<commit_message>
update: update activities card, refined people card, create google ai studio chatbot
</commit_message>
<xml_diff>
--- a/sk activities.docx
+++ b/sk activities.docx
@@ -728,6 +728,111 @@
         </w:r>
       </w:hyperlink>
     </w:p>
+    <w:p>
+      <w:proofErr w:type="spellStart"/>
+      <w:r>
+        <w:t>sksecandtreas</w:t>
+      </w:r>
+      <w:proofErr w:type="spellEnd"/>
+      <w:r>
+        <w:t xml:space="preserve"> link:</w:t>
+      </w:r>
+      <w:r>
+        <w:br/>
+      </w:r>
+      <w:hyperlink r:id="rId45" w:history="1">
+        <w:r>
+          <w:rPr>
+            <w:rStyle w:val="Hyperlink"/>
+          </w:rPr>
+          <w:t>https://www.facebook.com/photo/?fbid=678775697777555&amp;set=a.153869380268192</w:t>
+        </w:r>
+      </w:hyperlink>
+    </w:p>
+    <w:p>
+      <w:proofErr w:type="spellStart"/>
+      <w:r>
+        <w:t>gawad</w:t>
+      </w:r>
+      <w:proofErr w:type="spellEnd"/>
+      <w:r>
+        <w:t xml:space="preserve"> link:</w:t>
+      </w:r>
+      <w:r>
+        <w:br/>
+      </w:r>
+      <w:hyperlink r:id="rId46" w:history="1">
+        <w:r>
+          <w:rPr>
+            <w:rStyle w:val="Hyperlink"/>
+          </w:rPr>
+          <w:t>https://www.facebook.com/photo/?fbid=1487171103441818&amp;set=a.648416690650601</w:t>
+        </w:r>
+      </w:hyperlink>
+    </w:p>
+    <w:p/>
+    <w:p>
+      <w:proofErr w:type="spellStart"/>
+      <w:r>
+        <w:t>lpt</w:t>
+      </w:r>
+      <w:proofErr w:type="spellEnd"/>
+      <w:r>
+        <w:t xml:space="preserve"> link:</w:t>
+      </w:r>
+      <w:r>
+        <w:br/>
+      </w:r>
+      <w:hyperlink r:id="rId47" w:history="1">
+        <w:r>
+          <w:rPr>
+            <w:rStyle w:val="Hyperlink"/>
+          </w:rPr>
+          <w:t>https://www.facebook.com/photo/?fbid=1157542139900906&amp;set=a.153869373601</w:t>
+        </w:r>
+        <w:r>
+          <w:rPr>
+            <w:rStyle w:val="Hyperlink"/>
+          </w:rPr>
+          <w:t>5</w:t>
+        </w:r>
+        <w:r>
+          <w:rPr>
+            <w:rStyle w:val="Hyperlink"/>
+          </w:rPr>
+          <w:t>26</w:t>
+        </w:r>
+      </w:hyperlink>
+    </w:p>
+    <w:p>
+      <w:r>
+        <w:t>magna link:</w:t>
+      </w:r>
+      <w:r>
+        <w:br/>
+      </w:r>
+      <w:hyperlink r:id="rId48" w:history="1">
+        <w:r>
+          <w:rPr>
+            <w:rStyle w:val="Hyperlink"/>
+          </w:rPr>
+          <w:t>https://www.facebook.com/photo?fbid=1025522319769556&amp;set=a.10255219197695</w:t>
+        </w:r>
+        <w:r>
+          <w:rPr>
+            <w:rStyle w:val="Hyperlink"/>
+          </w:rPr>
+          <w:t>9</w:t>
+        </w:r>
+        <w:r>
+          <w:rPr>
+            <w:rStyle w:val="Hyperlink"/>
+          </w:rPr>
+          <w:t>6</w:t>
+        </w:r>
+      </w:hyperlink>
+    </w:p>
+    <w:p/>
     <w:p/>
     <w:sectPr>
       <w:pgSz w:w="12240" w:h="15840"/>
@@ -1679,6 +1784,18 @@
       <w:shd w:val="clear" w:color="auto" w:fill="E1DFDD"/>
     </w:rPr>
   </w:style>
+  <w:style w:type="character" w:styleId="FollowedHyperlink">
+    <w:name w:val="FollowedHyperlink"/>
+    <w:basedOn w:val="DefaultParagraphFont"/>
+    <w:uiPriority w:val="99"/>
+    <w:semiHidden/>
+    <w:unhideWhenUsed/>
+    <w:rsid w:val="00B2357C"/>
+    <w:rPr>
+      <w:color w:val="96607D" w:themeColor="followedHyperlink"/>
+      <w:u w:val="single"/>
+    </w:rPr>
+  </w:style>
 </w:styles>
 </file>
 

</xml_diff>